<commit_message>
Add print and fancy versions of Community Memo template
- Recreate ASPMG-Community-Memo.docx as clean B&W print version (no navy header)
- Add ASPMG-Community-Memo - fancy.docx with full-color navy header and gold accents
- Update index descriptions to match letterhead pattern (print vs elegante)

Co-Authored-By: Claude Opus 4.6 <noreply@anthropic.com>
</commit_message>
<xml_diff>
--- a/templates/ASPMG-Community-Memo.docx
+++ b/templates/ASPMG-Community-Memo.docx
@@ -6,10 +6,7 @@
       <w:tblPr>
         <w:tblW w:type="auto" w:w="0"/>
         <w:jc w:val="center"/>
-        <w:tblLayout w:type="fixed"/>
         <w:tblLook w:firstColumn="1" w:firstRow="1" w:lastColumn="0" w:lastRow="0" w:noHBand="0" w:noVBand="1" w:val="04A0"/>
-        <w:tblW w:w="5000" w:type="pct"/>
-        <w:tblCellSpacing w:w="0" w:type="dxa"/>
       </w:tblPr>
       <w:tblGrid>
         <w:gridCol w:w="4703"/>
@@ -18,30 +15,22 @@
       <w:tr>
         <w:tc>
           <w:tcPr>
-            <w:tcW w:type="dxa" w:w="6480"/>
+            <w:tcW w:type="dxa" w:w="5760"/>
             <w:tcBorders>
               <w:top w:val="none" w:sz="0" w:space="0" w:color="auto"/>
               <w:bottom w:val="none" w:sz="0" w:space="0" w:color="auto"/>
               <w:left w:val="none" w:sz="0" w:space="0" w:color="auto"/>
               <w:right w:val="none" w:sz="0" w:space="0" w:color="auto"/>
             </w:tcBorders>
-            <w:shd w:fill="1B2A4A"/>
-            <w:tcMar>
-              <w:top w:w="200" w:type="dxa"/>
-              <w:bottom w:w="200" w:type="dxa"/>
-              <w:left w:w="300" w:type="dxa"/>
-              <w:right w:w="300" w:type="dxa"/>
-            </w:tcMar>
           </w:tcPr>
           <w:p>
             <w:pPr>
-              <w:spacing w:before="0" w:after="0"/>
               <w:jc w:val="left"/>
             </w:pPr>
             <w:r>
               <w:drawing>
                 <wp:inline xmlns:a="http://schemas.openxmlformats.org/drawingml/2006/main" xmlns:pic="http://schemas.openxmlformats.org/drawingml/2006/picture">
-                  <wp:extent cx="502920" cy="448856"/>
+                  <wp:extent cx="457200" cy="408051"/>
                   <wp:docPr id="1" name="Picture 1"/>
                   <wp:cNvGraphicFramePr>
                     <a:graphicFrameLocks noChangeAspect="1"/>
@@ -62,7 +51,7 @@
                         <pic:spPr>
                           <a:xfrm>
                             <a:off x="0" y="0"/>
-                            <a:ext cx="502920" cy="448856"/>
+                            <a:ext cx="457200" cy="408051"/>
                           </a:xfrm>
                           <a:prstGeom prst="rect"/>
                         </pic:spPr>
@@ -74,22 +63,21 @@
             </w:r>
             <w:r>
               <w:rPr>
-                <w:b w:val="0"/>
-                <w:color w:val="FFFFFF"/>
-                <w:sz w:val="40"/>
+                <w:b/>
+                <w:color w:val="1B2A4A"/>
+                <w:sz w:val="36"/>
               </w:rPr>
               <w:t xml:space="preserve">  ASPMG</w:t>
             </w:r>
           </w:p>
           <w:p>
             <w:pPr>
-              <w:spacing w:before="40" w:after="0"/>
-              <w:jc w:val="left"/>
+              <w:spacing w:before="0" w:after="0"/>
             </w:pPr>
             <w:r>
               <w:rPr>
                 <w:b/>
-                <w:color w:val="A89060"/>
+                <w:color w:val="666666"/>
                 <w:sz w:val="14"/>
               </w:rPr>
               <w:t>A SOLID PROPERTY MANAGEMENT GROUP</w:t>
@@ -105,30 +93,22 @@
               <w:left w:val="none" w:sz="0" w:space="0" w:color="auto"/>
               <w:right w:val="none" w:sz="0" w:space="0" w:color="auto"/>
             </w:tcBorders>
-            <w:shd w:fill="1B2A4A"/>
-            <w:tcMar>
-              <w:top w:w="200" w:type="dxa"/>
-              <w:bottom w:w="200" w:type="dxa"/>
-              <w:left w:w="300" w:type="dxa"/>
-              <w:right w:w="300" w:type="dxa"/>
-            </w:tcMar>
           </w:tcPr>
           <w:p>
             <w:pPr>
-              <w:spacing w:before="80" w:after="0"/>
               <w:jc w:val="right"/>
             </w:pPr>
             <w:r>
               <w:rPr>
                 <w:b/>
-                <w:color w:val="A89060"/>
+                <w:color w:val="666666"/>
                 <w:sz w:val="16"/>
               </w:rPr>
-              <w:t xml:space="preserve">Phone </w:t>
+              <w:t xml:space="preserve">Tel: </w:t>
             </w:r>
             <w:r>
               <w:rPr>
-                <w:color w:val="FFFFFF"/>
+                <w:color w:val="1A1E2C"/>
                 <w:sz w:val="16"/>
               </w:rPr>
               <w:t>(305) 661-8400</w:t>
@@ -142,14 +122,14 @@
             <w:r>
               <w:rPr>
                 <w:b/>
-                <w:color w:val="A89060"/>
+                <w:color w:val="666666"/>
                 <w:sz w:val="16"/>
               </w:rPr>
-              <w:t xml:space="preserve">Email </w:t>
+              <w:t xml:space="preserve">Email: </w:t>
             </w:r>
             <w:r>
               <w:rPr>
-                <w:color w:val="FFFFFF"/>
+                <w:color w:val="1A1E2C"/>
                 <w:sz w:val="16"/>
               </w:rPr>
               <w:t>info@aspmg.com</w:t>
@@ -163,14 +143,14 @@
             <w:r>
               <w:rPr>
                 <w:b/>
-                <w:color w:val="A89060"/>
+                <w:color w:val="666666"/>
                 <w:sz w:val="16"/>
               </w:rPr>
-              <w:t xml:space="preserve">Web </w:t>
+              <w:t xml:space="preserve">Web: </w:t>
             </w:r>
             <w:r>
               <w:rPr>
-                <w:color w:val="FFFFFF"/>
+                <w:color w:val="1A1E2C"/>
                 <w:sz w:val="16"/>
               </w:rPr>
               <w:t>www.aspmg.com</w:t>
@@ -182,9 +162,7 @@
     <w:tbl>
       <w:tblPr>
         <w:tblW w:type="auto" w:w="0"/>
-        <w:jc w:val="center"/>
         <w:tblLook w:firstColumn="1" w:firstRow="1" w:lastColumn="0" w:lastRow="0" w:noHBand="0" w:noVBand="1" w:val="04A0"/>
-        <w:tblW w:w="5000" w:type="pct"/>
       </w:tblPr>
       <w:tblGrid>
         <w:gridCol w:w="9406"/>
@@ -193,27 +171,20 @@
         <w:tc>
           <w:tcPr>
             <w:tcW w:type="dxa" w:w="9406"/>
-            <w:shd w:fill="A89060"/>
             <w:tcBorders>
               <w:top w:val="none" w:sz="0" w:space="0" w:color="auto"/>
               <w:bottom w:val="none" w:sz="0" w:space="0" w:color="auto"/>
               <w:left w:val="none" w:sz="0" w:space="0" w:color="auto"/>
               <w:right w:val="none" w:sz="0" w:space="0" w:color="auto"/>
             </w:tcBorders>
-            <w:tcMar>
-              <w:top w:w="0" w:type="dxa"/>
-              <w:bottom w:w="0" w:type="dxa"/>
-              <w:left w:w="0" w:type="dxa"/>
-              <w:right w:w="0" w:type="dxa"/>
-            </w:tcMar>
+            <w:tcBorders>
+              <w:bottom w:val="single" w:sz="4" w:space="0" w:color="CCCCCC"/>
+            </w:tcBorders>
           </w:tcPr>
           <w:p>
-            <w:pPr>
-              <w:spacing w:before="0" w:after="0"/>
-            </w:pPr>
             <w:r>
               <w:rPr>
-                <w:sz w:val="6"/>
+                <w:sz w:val="2"/>
               </w:rPr>
             </w:r>
           </w:p>
@@ -227,15 +198,16 @@
     </w:p>
     <w:p>
       <w:pPr>
-        <w:spacing w:before="120" w:after="80"/>
+        <w:spacing w:before="0" w:after="80"/>
+        <w:jc w:val="left"/>
       </w:pPr>
       <w:r>
         <w:rPr>
           <w:b/>
-          <w:color w:val="A89060"/>
-          <w:sz w:val="16"/>
+          <w:color w:val="666666"/>
+          <w:sz w:val="18"/>
         </w:rPr>
-        <w:t xml:space="preserve">  COMMUNITY MEMO  </w:t>
+        <w:t>MEMO COMUNITARIO</w:t>
       </w:r>
     </w:p>
     <w:p>
@@ -247,9 +219,9 @@
         <w:rPr>
           <w:b w:val="0"/>
           <w:color w:val="1B2A4A"/>
-          <w:sz w:val="36"/>
+          <w:sz w:val="32"/>
         </w:rPr>
-        <w:t>[Memo Subject / Title]</w:t>
+        <w:t>[Asunto / Título del Memo]</w:t>
       </w:r>
     </w:p>
     <w:p>
@@ -260,10 +232,10 @@
       <w:r>
         <w:rPr>
           <w:b/>
-          <w:color w:val="A89060"/>
+          <w:color w:val="666666"/>
           <w:sz w:val="20"/>
         </w:rPr>
-        <w:t>[Community Name] Association</w:t>
+        <w:t>[Nombre de la Comunidad] Association</w:t>
       </w:r>
     </w:p>
     <w:tbl>
@@ -281,16 +253,15 @@
         <w:tc>
           <w:tcPr>
             <w:tcW w:type="dxa" w:w="2160"/>
-            <w:shd w:fill="F4F6FA"/>
           </w:tcPr>
           <w:p>
             <w:r>
               <w:rPr>
                 <w:b/>
-                <w:color w:val="A89060"/>
+                <w:color w:val="666666"/>
                 <w:sz w:val="16"/>
               </w:rPr>
-              <w:t>DATE</w:t>
+              <w:t>FECHA</w:t>
             </w:r>
           </w:p>
         </w:tc>
@@ -301,10 +272,10 @@
           <w:p>
             <w:r>
               <w:rPr>
-                <w:color w:val="1B2A4A"/>
+                <w:color w:val="1A1E2C"/>
                 <w:sz w:val="21"/>
               </w:rPr>
-              <w:t>[Month Day, Year]</w:t>
+              <w:t>[Día Mes, Año]</w:t>
             </w:r>
           </w:p>
         </w:tc>
@@ -313,16 +284,15 @@
         <w:tc>
           <w:tcPr>
             <w:tcW w:type="dxa" w:w="2160"/>
-            <w:shd w:fill="F4F6FA"/>
           </w:tcPr>
           <w:p>
             <w:r>
               <w:rPr>
                 <w:b/>
-                <w:color w:val="A89060"/>
+                <w:color w:val="666666"/>
                 <w:sz w:val="16"/>
               </w:rPr>
-              <w:t>TO</w:t>
+              <w:t>PARA</w:t>
             </w:r>
           </w:p>
         </w:tc>
@@ -333,10 +303,10 @@
           <w:p>
             <w:r>
               <w:rPr>
-                <w:color w:val="1B2A4A"/>
+                <w:color w:val="1A1E2C"/>
                 <w:sz w:val="21"/>
               </w:rPr>
-              <w:t>All Residents &amp; Unit Owners</w:t>
+              <w:t>Todos los Residentes y Propietarios</w:t>
             </w:r>
           </w:p>
         </w:tc>
@@ -345,16 +315,15 @@
         <w:tc>
           <w:tcPr>
             <w:tcW w:type="dxa" w:w="2160"/>
-            <w:shd w:fill="F4F6FA"/>
           </w:tcPr>
           <w:p>
             <w:r>
               <w:rPr>
                 <w:b/>
-                <w:color w:val="A89060"/>
+                <w:color w:val="666666"/>
                 <w:sz w:val="16"/>
               </w:rPr>
-              <w:t>FROM</w:t>
+              <w:t>DE</w:t>
             </w:r>
           </w:p>
         </w:tc>
@@ -365,10 +334,10 @@
           <w:p>
             <w:r>
               <w:rPr>
-                <w:color w:val="1B2A4A"/>
+                <w:color w:val="1A1E2C"/>
                 <w:sz w:val="21"/>
               </w:rPr>
-              <w:t>ASPMG — Property Management</w:t>
+              <w:t>ASPMG — Administración de Propiedades</w:t>
             </w:r>
           </w:p>
         </w:tc>
@@ -377,16 +346,15 @@
         <w:tc>
           <w:tcPr>
             <w:tcW w:type="dxa" w:w="2160"/>
-            <w:shd w:fill="F4F6FA"/>
           </w:tcPr>
           <w:p>
             <w:r>
               <w:rPr>
                 <w:b/>
-                <w:color w:val="A89060"/>
+                <w:color w:val="666666"/>
                 <w:sz w:val="16"/>
               </w:rPr>
-              <w:t>PRIORITY</w:t>
+              <w:t>PRIORIDAD</w:t>
             </w:r>
           </w:p>
         </w:tc>
@@ -397,10 +365,10 @@
           <w:p>
             <w:r>
               <w:rPr>
-                <w:color w:val="1B2A4A"/>
+                <w:color w:val="1A1E2C"/>
                 <w:sz w:val="21"/>
               </w:rPr>
-              <w:t>[Normal / Important / Urgent]</w:t>
+              <w:t>[Normal / Importante / Urgente]</w:t>
             </w:r>
           </w:p>
         </w:tc>
@@ -422,7 +390,7 @@
           <w:color w:val="1A1E2C"/>
           <w:sz w:val="22"/>
         </w:rPr>
-        <w:t>Dear Residents,</w:t>
+        <w:t>Estimados Residentes,</w:t>
       </w:r>
     </w:p>
     <w:p>
@@ -450,7 +418,7 @@
           <w:color w:val="1B2A4A"/>
           <w:sz w:val="26"/>
         </w:rPr>
-        <w:t>Key Information</w:t>
+        <w:t>Información Importante</w:t>
       </w:r>
     </w:p>
     <w:p>
@@ -459,7 +427,7 @@
         <w:spacing w:after="60"/>
       </w:pPr>
       <w:r>
-        <w:t>First important point or update</w:t>
+        <w:t>Primer punto importante o actualización</w:t>
       </w:r>
     </w:p>
     <w:p>
@@ -468,7 +436,7 @@
         <w:spacing w:after="60"/>
       </w:pPr>
       <w:r>
-        <w:t>Second important point or update</w:t>
+        <w:t>Segundo punto importante o actualización</w:t>
       </w:r>
     </w:p>
     <w:p>
@@ -477,49 +445,9 @@
         <w:spacing w:after="60"/>
       </w:pPr>
       <w:r>
-        <w:t>Third important point or update</w:t>
+        <w:t>Tercer punto importante o actualización</w:t>
       </w:r>
     </w:p>
-    <w:tbl>
-      <w:tblPr>
-        <w:tblW w:type="auto" w:w="0"/>
-        <w:tblLook w:firstColumn="1" w:firstRow="1" w:lastColumn="0" w:lastRow="0" w:noHBand="0" w:noVBand="1" w:val="04A0"/>
-      </w:tblPr>
-      <w:tblGrid>
-        <w:gridCol w:w="9406"/>
-      </w:tblGrid>
-      <w:tr>
-        <w:tc>
-          <w:tcPr>
-            <w:tcW w:type="dxa" w:w="9406"/>
-            <w:shd w:fill="F4F6FA"/>
-            <w:tcBorders>
-              <w:left w:val="single" w:sz="18" w:space="0" w:color="A89060"/>
-              <w:top w:val="none" w:sz="0" w:space="0" w:color="auto"/>
-              <w:bottom w:val="none" w:sz="0" w:space="0" w:color="auto"/>
-              <w:right w:val="none" w:sz="0" w:space="0" w:color="auto"/>
-            </w:tcBorders>
-          </w:tcPr>
-          <w:p>
-            <w:r>
-              <w:rPr>
-                <w:b/>
-                <w:color w:val="1B2A4A"/>
-                <w:sz w:val="21"/>
-              </w:rPr>
-              <w:t xml:space="preserve">Important: </w:t>
-            </w:r>
-            <w:r>
-              <w:rPr>
-                <w:color w:val="1A1E2C"/>
-                <w:sz w:val="21"/>
-              </w:rPr>
-              <w:t>[Key action item or deadline that residents need to be aware of.]</w:t>
-            </w:r>
-          </w:p>
-        </w:tc>
-      </w:tr>
-    </w:tbl>
     <w:p>
       <w:pPr>
         <w:spacing w:after="80"/>
@@ -536,7 +464,7 @@
           <w:color w:val="1A1E2C"/>
           <w:sz w:val="22"/>
         </w:rPr>
-        <w:t>If you have any questions or concerns, please do not hesitate to contact our office at (305) 661-8400 or email us at info@aspmg.com.</w:t>
+        <w:t>Si tiene alguna pregunta o inquietud, no dude en contactar nuestra oficina al (305) 661-8400 o envíenos un correo a info@aspmg.com.</w:t>
       </w:r>
     </w:p>
     <w:p>
@@ -550,7 +478,7 @@
           <w:color w:val="1A1E2C"/>
           <w:sz w:val="22"/>
         </w:rPr>
-        <w:t>Thank you for your cooperation and for being a valued member of our community.</w:t>
+        <w:t>Gracias por su cooperación y por ser un miembro valioso de nuestra comunidad.</w:t>
       </w:r>
     </w:p>
     <w:p>
@@ -564,7 +492,7 @@
           <w:color w:val="1B2A4A"/>
           <w:sz w:val="22"/>
         </w:rPr>
-        <w:t>ASPMG Management Team</w:t>
+        <w:t>Equipo de Administración ASPMG</w:t>
       </w:r>
     </w:p>
     <w:p>
@@ -575,7 +503,7 @@
       <w:r>
         <w:rPr>
           <w:b w:val="0"/>
-          <w:color w:val="A89060"/>
+          <w:color w:val="666666"/>
           <w:sz w:val="20"/>
         </w:rPr>
         <w:t>A Solid Property Management Group</w:t>
@@ -603,7 +531,7 @@
               <w:right w:val="none" w:sz="0" w:space="0" w:color="auto"/>
             </w:tcBorders>
             <w:tcBorders>
-              <w:top w:val="single" w:sz="4" w:space="0" w:color="E0E0E0"/>
+              <w:top w:val="single" w:sz="4" w:space="0" w:color="CCCCCC"/>
             </w:tcBorders>
           </w:tcPr>
           <w:p>
@@ -629,7 +557,7 @@
               <w:right w:val="none" w:sz="0" w:space="0" w:color="auto"/>
             </w:tcBorders>
             <w:tcBorders>
-              <w:top w:val="single" w:sz="4" w:space="0" w:color="E0E0E0"/>
+              <w:top w:val="single" w:sz="4" w:space="0" w:color="CCCCCC"/>
             </w:tcBorders>
           </w:tcPr>
           <w:p>
@@ -649,7 +577,7 @@
     </w:tbl>
     <w:sectPr>
       <w:pgSz w:w="12240" w:h="15840"/>
-      <w:pgMar w:top="283" w:right="1417" w:bottom="850" w:left="1417" w:header="720" w:footer="720" w:gutter="0"/>
+      <w:pgMar w:top="850" w:right="1417" w:bottom="850" w:left="1417" w:header="720" w:footer="720" w:gutter="0"/>
       <w:cols w:space="720"/>
       <w:docGrid w:linePitch="360"/>
     </w:sectPr>

</xml_diff>